<commit_message>
Registra painel publicado no Render e repositorio no GitHub
Co-Authored-By: Claude Opus 5.5 <noreply@anthropic.com>
</commit_message>
<xml_diff>
--- a/docs/relatorio/Relatorio_Parcial_PI2.docx
+++ b/docs/relatorio/Relatorio_Parcial_PI2.docx
@@ -693,7 +693,7 @@
       <w:r>
         <w:fldChar w:fldCharType="separate"/>
       </w:r>
-      <w:hyperlink w:anchor="_Toc241604120" w:history="1">
+      <w:hyperlink w:anchor="_Toc241607331" w:history="1">
         <w:r>
           <w:rPr>
             <w:rStyle w:val="Hyperlink"/>
@@ -720,7 +720,7 @@
             <w:noProof/>
             <w:webHidden/>
           </w:rPr>
-          <w:instrText xml:space="preserve"> PAGEREF _Toc241604120 \h </w:instrText>
+          <w:instrText xml:space="preserve"> PAGEREF _Toc241607331 \h </w:instrText>
         </w:r>
         <w:r>
           <w:rPr>
@@ -764,7 +764,7 @@
           <w14:ligatures w14:val="standardContextual"/>
         </w:rPr>
       </w:pPr>
-      <w:hyperlink w:anchor="_Toc241604121" w:history="1">
+      <w:hyperlink w:anchor="_Toc241607332" w:history="1">
         <w:r>
           <w:rPr>
             <w:rStyle w:val="Hyperlink"/>
@@ -791,7 +791,7 @@
             <w:noProof/>
             <w:webHidden/>
           </w:rPr>
-          <w:instrText xml:space="preserve"> PAGEREF _Toc241604121 \h </w:instrText>
+          <w:instrText xml:space="preserve"> PAGEREF _Toc241607332 \h </w:instrText>
         </w:r>
         <w:r>
           <w:rPr>
@@ -835,7 +835,7 @@
           <w14:ligatures w14:val="standardContextual"/>
         </w:rPr>
       </w:pPr>
-      <w:hyperlink w:anchor="_Toc241604122" w:history="1">
+      <w:hyperlink w:anchor="_Toc241607333" w:history="1">
         <w:r>
           <w:rPr>
             <w:rStyle w:val="Hyperlink"/>
@@ -862,7 +862,7 @@
             <w:noProof/>
             <w:webHidden/>
           </w:rPr>
-          <w:instrText xml:space="preserve"> PAGEREF _Toc241604122 \h </w:instrText>
+          <w:instrText xml:space="preserve"> PAGEREF _Toc241607333 \h </w:instrText>
         </w:r>
         <w:r>
           <w:rPr>
@@ -906,7 +906,7 @@
           <w14:ligatures w14:val="standardContextual"/>
         </w:rPr>
       </w:pPr>
-      <w:hyperlink w:anchor="_Toc241604123" w:history="1">
+      <w:hyperlink w:anchor="_Toc241607334" w:history="1">
         <w:r>
           <w:rPr>
             <w:rStyle w:val="Hyperlink"/>
@@ -933,7 +933,7 @@
             <w:noProof/>
             <w:webHidden/>
           </w:rPr>
-          <w:instrText xml:space="preserve"> PAGEREF _Toc241604123 \h </w:instrText>
+          <w:instrText xml:space="preserve"> PAGEREF _Toc241607334 \h </w:instrText>
         </w:r>
         <w:r>
           <w:rPr>
@@ -977,7 +977,7 @@
           <w14:ligatures w14:val="standardContextual"/>
         </w:rPr>
       </w:pPr>
-      <w:hyperlink w:anchor="_Toc241604124" w:history="1">
+      <w:hyperlink w:anchor="_Toc241607335" w:history="1">
         <w:r>
           <w:rPr>
             <w:rStyle w:val="Hyperlink"/>
@@ -1004,7 +1004,7 @@
             <w:noProof/>
             <w:webHidden/>
           </w:rPr>
-          <w:instrText xml:space="preserve"> PAGEREF _Toc241604124 \h </w:instrText>
+          <w:instrText xml:space="preserve"> PAGEREF _Toc241607335 \h </w:instrText>
         </w:r>
         <w:r>
           <w:rPr>
@@ -1096,7 +1096,7 @@
       <w:r>
         <w:fldChar w:fldCharType="separate"/>
       </w:r>
-      <w:hyperlink w:anchor="_Toc241604125" w:history="1">
+      <w:hyperlink w:anchor="_Toc241607336" w:history="1">
         <w:r>
           <w:rPr>
             <w:rStyle w:val="Hyperlink"/>
@@ -1123,7 +1123,7 @@
             <w:noProof/>
             <w:webHidden/>
           </w:rPr>
-          <w:instrText xml:space="preserve"> PAGEREF _Toc241604125 \h </w:instrText>
+          <w:instrText xml:space="preserve"> PAGEREF _Toc241607336 \h </w:instrText>
         </w:r>
         <w:r>
           <w:rPr>
@@ -1167,7 +1167,7 @@
           <w14:ligatures w14:val="standardContextual"/>
         </w:rPr>
       </w:pPr>
-      <w:hyperlink w:anchor="_Toc241604126" w:history="1">
+      <w:hyperlink w:anchor="_Toc241607337" w:history="1">
         <w:r>
           <w:rPr>
             <w:rStyle w:val="Hyperlink"/>
@@ -1194,7 +1194,7 @@
             <w:noProof/>
             <w:webHidden/>
           </w:rPr>
-          <w:instrText xml:space="preserve"> PAGEREF _Toc241604126 \h </w:instrText>
+          <w:instrText xml:space="preserve"> PAGEREF _Toc241607337 \h </w:instrText>
         </w:r>
         <w:r>
           <w:rPr>
@@ -1238,7 +1238,7 @@
           <w14:ligatures w14:val="standardContextual"/>
         </w:rPr>
       </w:pPr>
-      <w:hyperlink w:anchor="_Toc241604127" w:history="1">
+      <w:hyperlink w:anchor="_Toc241607338" w:history="1">
         <w:r>
           <w:rPr>
             <w:rStyle w:val="Hyperlink"/>
@@ -1265,7 +1265,7 @@
             <w:noProof/>
             <w:webHidden/>
           </w:rPr>
-          <w:instrText xml:space="preserve"> PAGEREF _Toc241604127 \h </w:instrText>
+          <w:instrText xml:space="preserve"> PAGEREF _Toc241607338 \h </w:instrText>
         </w:r>
         <w:r>
           <w:rPr>
@@ -1309,7 +1309,7 @@
           <w14:ligatures w14:val="standardContextual"/>
         </w:rPr>
       </w:pPr>
-      <w:hyperlink w:anchor="_Toc241604128" w:history="1">
+      <w:hyperlink w:anchor="_Toc241607339" w:history="1">
         <w:r>
           <w:rPr>
             <w:rStyle w:val="Hyperlink"/>
@@ -1336,7 +1336,7 @@
             <w:noProof/>
             <w:webHidden/>
           </w:rPr>
-          <w:instrText xml:space="preserve"> PAGEREF _Toc241604128 \h </w:instrText>
+          <w:instrText xml:space="preserve"> PAGEREF _Toc241607339 \h </w:instrText>
         </w:r>
         <w:r>
           <w:rPr>
@@ -1380,7 +1380,7 @@
           <w14:ligatures w14:val="standardContextual"/>
         </w:rPr>
       </w:pPr>
-      <w:hyperlink w:anchor="_Toc241604129" w:history="1">
+      <w:hyperlink w:anchor="_Toc241607340" w:history="1">
         <w:r>
           <w:rPr>
             <w:rStyle w:val="Hyperlink"/>
@@ -1407,7 +1407,7 @@
             <w:noProof/>
             <w:webHidden/>
           </w:rPr>
-          <w:instrText xml:space="preserve"> PAGEREF _Toc241604129 \h </w:instrText>
+          <w:instrText xml:space="preserve"> PAGEREF _Toc241607340 \h </w:instrText>
         </w:r>
         <w:r>
           <w:rPr>
@@ -1506,7 +1506,7 @@
       <w:r>
         <w:fldChar w:fldCharType="separate"/>
       </w:r>
-      <w:hyperlink w:anchor="_Toc241604111" w:history="1">
+      <w:hyperlink w:anchor="_Toc241607322" w:history="1">
         <w:r>
           <w:rPr>
             <w:rStyle w:val="Hyperlink"/>
@@ -1533,7 +1533,7 @@
             <w:noProof/>
             <w:webHidden/>
           </w:rPr>
-          <w:instrText xml:space="preserve"> PAGEREF _Toc241604111 \h </w:instrText>
+          <w:instrText xml:space="preserve"> PAGEREF _Toc241607322 \h </w:instrText>
         </w:r>
         <w:r>
           <w:rPr>
@@ -1576,7 +1576,7 @@
           <w14:ligatures w14:val="standardContextual"/>
         </w:rPr>
       </w:pPr>
-      <w:hyperlink w:anchor="_Toc241604112" w:history="1">
+      <w:hyperlink w:anchor="_Toc241607323" w:history="1">
         <w:r>
           <w:rPr>
             <w:rStyle w:val="Hyperlink"/>
@@ -1603,7 +1603,7 @@
             <w:noProof/>
             <w:webHidden/>
           </w:rPr>
-          <w:instrText xml:space="preserve"> PAGEREF _Toc241604112 \h </w:instrText>
+          <w:instrText xml:space="preserve"> PAGEREF _Toc241607323 \h </w:instrText>
         </w:r>
         <w:r>
           <w:rPr>
@@ -1644,7 +1644,7 @@
           <w14:ligatures w14:val="standardContextual"/>
         </w:rPr>
       </w:pPr>
-      <w:hyperlink w:anchor="_Toc241604113" w:history="1">
+      <w:hyperlink w:anchor="_Toc241607324" w:history="1">
         <w:r>
           <w:rPr>
             <w:rStyle w:val="Hyperlink"/>
@@ -1671,7 +1671,7 @@
             <w:noProof/>
             <w:webHidden/>
           </w:rPr>
-          <w:instrText xml:space="preserve"> PAGEREF _Toc241604113 \h </w:instrText>
+          <w:instrText xml:space="preserve"> PAGEREF _Toc241607324 \h </w:instrText>
         </w:r>
         <w:r>
           <w:rPr>
@@ -1712,7 +1712,7 @@
           <w14:ligatures w14:val="standardContextual"/>
         </w:rPr>
       </w:pPr>
-      <w:hyperlink w:anchor="_Toc241604114" w:history="1">
+      <w:hyperlink w:anchor="_Toc241607325" w:history="1">
         <w:r>
           <w:rPr>
             <w:rStyle w:val="Hyperlink"/>
@@ -1739,7 +1739,7 @@
             <w:noProof/>
             <w:webHidden/>
           </w:rPr>
-          <w:instrText xml:space="preserve"> PAGEREF _Toc241604114 \h </w:instrText>
+          <w:instrText xml:space="preserve"> PAGEREF _Toc241607325 \h </w:instrText>
         </w:r>
         <w:r>
           <w:rPr>
@@ -1780,7 +1780,7 @@
           <w14:ligatures w14:val="standardContextual"/>
         </w:rPr>
       </w:pPr>
-      <w:hyperlink w:anchor="_Toc241604115" w:history="1">
+      <w:hyperlink w:anchor="_Toc241607326" w:history="1">
         <w:r>
           <w:rPr>
             <w:rStyle w:val="Hyperlink"/>
@@ -1807,7 +1807,7 @@
             <w:noProof/>
             <w:webHidden/>
           </w:rPr>
-          <w:instrText xml:space="preserve"> PAGEREF _Toc241604115 \h </w:instrText>
+          <w:instrText xml:space="preserve"> PAGEREF _Toc241607326 \h </w:instrText>
         </w:r>
         <w:r>
           <w:rPr>
@@ -1848,7 +1848,7 @@
           <w14:ligatures w14:val="standardContextual"/>
         </w:rPr>
       </w:pPr>
-      <w:hyperlink w:anchor="_Toc241604116" w:history="1">
+      <w:hyperlink w:anchor="_Toc241607327" w:history="1">
         <w:r>
           <w:rPr>
             <w:rStyle w:val="Hyperlink"/>
@@ -1875,7 +1875,7 @@
             <w:noProof/>
             <w:webHidden/>
           </w:rPr>
-          <w:instrText xml:space="preserve"> PAGEREF _Toc241604116 \h </w:instrText>
+          <w:instrText xml:space="preserve"> PAGEREF _Toc241607327 \h </w:instrText>
         </w:r>
         <w:r>
           <w:rPr>
@@ -1916,7 +1916,7 @@
           <w14:ligatures w14:val="standardContextual"/>
         </w:rPr>
       </w:pPr>
-      <w:hyperlink w:anchor="_Toc241604117" w:history="1">
+      <w:hyperlink w:anchor="_Toc241607328" w:history="1">
         <w:r>
           <w:rPr>
             <w:rStyle w:val="Hyperlink"/>
@@ -1943,7 +1943,7 @@
             <w:noProof/>
             <w:webHidden/>
           </w:rPr>
-          <w:instrText xml:space="preserve"> PAGEREF _Toc241604117 \h </w:instrText>
+          <w:instrText xml:space="preserve"> PAGEREF _Toc241607328 \h </w:instrText>
         </w:r>
         <w:r>
           <w:rPr>
@@ -1986,7 +1986,7 @@
           <w14:ligatures w14:val="standardContextual"/>
         </w:rPr>
       </w:pPr>
-      <w:hyperlink w:anchor="_Toc241604118" w:history="1">
+      <w:hyperlink w:anchor="_Toc241607329" w:history="1">
         <w:r>
           <w:rPr>
             <w:rStyle w:val="Hyperlink"/>
@@ -2013,7 +2013,7 @@
             <w:noProof/>
             <w:webHidden/>
           </w:rPr>
-          <w:instrText xml:space="preserve"> PAGEREF _Toc241604118 \h </w:instrText>
+          <w:instrText xml:space="preserve"> PAGEREF _Toc241607329 \h </w:instrText>
         </w:r>
         <w:r>
           <w:rPr>
@@ -2056,7 +2056,7 @@
           <w14:ligatures w14:val="standardContextual"/>
         </w:rPr>
       </w:pPr>
-      <w:hyperlink w:anchor="_Toc241604119" w:history="1">
+      <w:hyperlink w:anchor="_Toc241607330" w:history="1">
         <w:r>
           <w:rPr>
             <w:rStyle w:val="Hyperlink"/>
@@ -2083,7 +2083,7 @@
             <w:noProof/>
             <w:webHidden/>
           </w:rPr>
-          <w:instrText xml:space="preserve"> PAGEREF _Toc241604119 \h </w:instrText>
+          <w:instrText xml:space="preserve"> PAGEREF _Toc241607330 \h </w:instrText>
         </w:r>
         <w:r>
           <w:rPr>
@@ -2132,7 +2132,7 @@
       <w:pPr>
         <w:pStyle w:val="1ttulonivel1"/>
       </w:pPr>
-      <w:bookmarkStart w:id="0" w:name="_Toc241604111"/>
+      <w:bookmarkStart w:id="0" w:name="_Toc241607322"/>
       <w:r>
         <w:lastRenderedPageBreak/>
         <w:t>1 Introdução</w:t>
@@ -2202,7 +2202,7 @@
       <w:pPr>
         <w:pStyle w:val="1ttulonivel1"/>
       </w:pPr>
-      <w:bookmarkStart w:id="1" w:name="_Toc241604112"/>
+      <w:bookmarkStart w:id="1" w:name="_Toc241607323"/>
       <w:r>
         <w:lastRenderedPageBreak/>
         <w:t>2 Desenvolvimento</w:t>
@@ -2213,7 +2213,7 @@
       <w:pPr>
         <w:pStyle w:val="2ttulonivel2"/>
       </w:pPr>
-      <w:bookmarkStart w:id="2" w:name="_Toc241604113"/>
+      <w:bookmarkStart w:id="2" w:name="_Toc241607324"/>
       <w:r>
         <w:t>2.1 Objetivos</w:t>
       </w:r>
@@ -2288,7 +2288,7 @@
       <w:pPr>
         <w:pStyle w:val="2ttulonivel2"/>
       </w:pPr>
-      <w:bookmarkStart w:id="3" w:name="_Toc241604114"/>
+      <w:bookmarkStart w:id="3" w:name="_Toc241607325"/>
       <w:r>
         <w:t>2.2 Justificativa e delimitação do problema</w:t>
       </w:r>
@@ -2378,7 +2378,7 @@
       <w:pPr>
         <w:pStyle w:val="2ttulonivel2"/>
       </w:pPr>
-      <w:bookmarkStart w:id="4" w:name="_Toc241604115"/>
+      <w:bookmarkStart w:id="4" w:name="_Toc241607326"/>
       <w:r>
         <w:t>2.3 Fundamentação teórica</w:t>
       </w:r>
@@ -2504,7 +2504,7 @@
       <w:pPr>
         <w:pStyle w:val="2ttulonivel2"/>
       </w:pPr>
-      <w:bookmarkStart w:id="5" w:name="_Toc241604116"/>
+      <w:bookmarkStart w:id="5" w:name="_Toc241607327"/>
       <w:r>
         <w:lastRenderedPageBreak/>
         <w:t>2.4 Metodologia</w:t>
@@ -2584,7 +2584,7 @@
         <w:spacing w:after="80" w:line="240" w:lineRule="auto"/>
         <w:jc w:val="left"/>
       </w:pPr>
-      <w:bookmarkStart w:id="6" w:name="_Toc241604125"/>
+      <w:bookmarkStart w:id="6" w:name="_Toc241607336"/>
       <w:r>
         <w:rPr>
           <w:sz w:val="20"/>
@@ -3172,7 +3172,7 @@
         <w:spacing w:after="80" w:line="240" w:lineRule="auto"/>
         <w:jc w:val="center"/>
       </w:pPr>
-      <w:bookmarkStart w:id="7" w:name="_Toc241604120"/>
+      <w:bookmarkStart w:id="7" w:name="_Toc241607331"/>
       <w:r>
         <w:rPr>
           <w:sz w:val="20"/>
@@ -3220,7 +3220,7 @@
           <w:noProof/>
         </w:rPr>
         <w:drawing>
-          <wp:inline distT="0" distB="0" distL="0" distR="0" wp14:anchorId="429478AE" wp14:editId="54E68426">
+          <wp:inline distT="0" distB="0" distL="0" distR="0" wp14:anchorId="1F4C4391" wp14:editId="4BC8D7F5">
             <wp:extent cx="5760000" cy="1958400"/>
             <wp:effectExtent l="0" t="0" r="0" b="0"/>
             <wp:docPr id="1" name="Picture 1"/>
@@ -3293,7 +3293,7 @@
         <w:spacing w:after="80" w:line="240" w:lineRule="auto"/>
         <w:jc w:val="left"/>
       </w:pPr>
-      <w:bookmarkStart w:id="8" w:name="_Toc241604126"/>
+      <w:bookmarkStart w:id="8" w:name="_Toc241607337"/>
       <w:r>
         <w:rPr>
           <w:sz w:val="20"/>
@@ -3809,7 +3809,7 @@
       <w:pPr>
         <w:pStyle w:val="2ttulonivel2"/>
       </w:pPr>
-      <w:bookmarkStart w:id="9" w:name="_Toc241604117"/>
+      <w:bookmarkStart w:id="9" w:name="_Toc241607328"/>
       <w:r>
         <w:t>2.5 Resultados preliminares: solução inicial</w:t>
       </w:r>
@@ -3867,7 +3867,7 @@
         <w:spacing w:after="80" w:line="240" w:lineRule="auto"/>
         <w:jc w:val="center"/>
       </w:pPr>
-      <w:bookmarkStart w:id="10" w:name="_Toc241604121"/>
+      <w:bookmarkStart w:id="10" w:name="_Toc241607332"/>
       <w:r>
         <w:rPr>
           <w:sz w:val="20"/>
@@ -3916,7 +3916,7 @@
           <w:noProof/>
         </w:rPr>
         <w:drawing>
-          <wp:inline distT="0" distB="0" distL="0" distR="0" wp14:anchorId="2A6896F3" wp14:editId="0973A666">
+          <wp:inline distT="0" distB="0" distL="0" distR="0" wp14:anchorId="7311BA60" wp14:editId="0A27F60E">
             <wp:extent cx="5220000" cy="5167800"/>
             <wp:effectExtent l="0" t="0" r="0" b="0"/>
             <wp:docPr id="2" name="Picture 2"/>
@@ -3980,7 +3980,7 @@
         <w:spacing w:after="80" w:line="240" w:lineRule="auto"/>
         <w:jc w:val="left"/>
       </w:pPr>
-      <w:bookmarkStart w:id="11" w:name="_Toc241604127"/>
+      <w:bookmarkStart w:id="11" w:name="_Toc241607338"/>
       <w:r>
         <w:rPr>
           <w:sz w:val="20"/>
@@ -4524,7 +4524,7 @@
         <w:spacing w:after="80" w:line="240" w:lineRule="auto"/>
         <w:jc w:val="center"/>
       </w:pPr>
-      <w:bookmarkStart w:id="12" w:name="_Toc241604122"/>
+      <w:bookmarkStart w:id="12" w:name="_Toc241607333"/>
       <w:r>
         <w:rPr>
           <w:sz w:val="20"/>
@@ -4572,7 +4572,7 @@
           <w:noProof/>
         </w:rPr>
         <w:drawing>
-          <wp:inline distT="0" distB="0" distL="0" distR="0" wp14:anchorId="34C33A6C" wp14:editId="40A510E2">
+          <wp:inline distT="0" distB="0" distL="0" distR="0" wp14:anchorId="3A173042" wp14:editId="26A31E28">
             <wp:extent cx="5220000" cy="4123800"/>
             <wp:effectExtent l="0" t="0" r="0" b="0"/>
             <wp:docPr id="3" name="Picture 3"/>
@@ -4628,7 +4628,7 @@
         <w:spacing w:after="80" w:line="240" w:lineRule="auto"/>
         <w:jc w:val="left"/>
       </w:pPr>
-      <w:bookmarkStart w:id="13" w:name="_Toc241604128"/>
+      <w:bookmarkStart w:id="13" w:name="_Toc241607339"/>
       <w:r>
         <w:rPr>
           <w:sz w:val="20"/>
@@ -5107,7 +5107,7 @@
         <w:spacing w:after="80" w:line="240" w:lineRule="auto"/>
         <w:jc w:val="left"/>
       </w:pPr>
-      <w:bookmarkStart w:id="14" w:name="_Toc241604129"/>
+      <w:bookmarkStart w:id="14" w:name="_Toc241607340"/>
       <w:r>
         <w:rPr>
           <w:sz w:val="20"/>
@@ -5666,7 +5666,7 @@
         <w:spacing w:after="80" w:line="240" w:lineRule="auto"/>
         <w:jc w:val="center"/>
       </w:pPr>
-      <w:bookmarkStart w:id="15" w:name="_Toc241604123"/>
+      <w:bookmarkStart w:id="15" w:name="_Toc241607334"/>
       <w:r>
         <w:rPr>
           <w:sz w:val="20"/>
@@ -5714,7 +5714,7 @@
           <w:noProof/>
         </w:rPr>
         <w:drawing>
-          <wp:inline distT="0" distB="0" distL="0" distR="0" wp14:anchorId="17858B2A" wp14:editId="793894A9">
+          <wp:inline distT="0" distB="0" distL="0" distR="0" wp14:anchorId="5AC8B7A0" wp14:editId="61395FD2">
             <wp:extent cx="5400000" cy="2835000"/>
             <wp:effectExtent l="0" t="0" r="0" b="0"/>
             <wp:docPr id="4" name="Picture 4"/>
@@ -5811,7 +5811,7 @@
         <w:spacing w:after="80" w:line="240" w:lineRule="auto"/>
         <w:jc w:val="center"/>
       </w:pPr>
-      <w:bookmarkStart w:id="16" w:name="_Toc241604124"/>
+      <w:bookmarkStart w:id="16" w:name="_Toc241607335"/>
       <w:r>
         <w:rPr>
           <w:sz w:val="20"/>
@@ -5859,7 +5859,7 @@
           <w:noProof/>
         </w:rPr>
         <w:drawing>
-          <wp:inline distT="0" distB="0" distL="0" distR="0" wp14:anchorId="0AABFF66" wp14:editId="0371A408">
+          <wp:inline distT="0" distB="0" distL="0" distR="0" wp14:anchorId="711DEE4D" wp14:editId="244BF935">
             <wp:extent cx="5220000" cy="3680100"/>
             <wp:effectExtent l="0" t="0" r="0" b="0"/>
             <wp:docPr id="5" name="Picture 5"/>
@@ -5929,7 +5929,7 @@
         <w:t>verificada com o axe-core (regras WCAG 2.0 e 2.1, níveis A e AA), sem violações, e complementada por medição direta: todos os textos têm contraste entre 7,2:1 e 17,4:1 (o mínimo AA é 4,5:1) e as cores dos gráficos têm no mínimo 4,9:1 contra o fundo (o mínimo para elementos não textuais é 3:1). A navegação por teclado foi testada: há link para pular ao conteúdo, os botões de tabela funcionam com a tecla Enter e informam o estado aberto ou fechado ao leitor de tela, e o foco tem contorno visível. Em</w:t>
       </w:r>
       <w:r>
-        <w:t xml:space="preserve"> tela de celular (375 pixels) não há rolagem horizontal. Ferramentas automáticas não substituem o teste com usuários de tecnologia assistiva, que será buscado na aplicação do questionário. O código está versionado em Git desde o início, com 38 registros (</w:t>
+        <w:t xml:space="preserve"> tela de celular (375 pixels) não há rolagem horizontal. Ferramentas automáticas não substituem o teste com usuários de tecnologia assistiva, que será buscado na aplicação do questionário. O código está versionado em Git desde o início, com 41 registros (</w:t>
       </w:r>
       <w:r>
         <w:rPr>
@@ -5938,7 +5938,10 @@
         <w:t>commits</w:t>
       </w:r>
       <w:r>
-        <w:t>) descritivos até a data deste relatório.</w:t>
+        <w:t>) descritivos até a data deste relatório, publicados em repositório público no GitHub (https://github.com/GustavoTreymann/painel-dengue-marilia). O painel está em produção no Render (https://painel-dengue-marilia.onrender.com), com banco PostgreSQL no Neon, ambos em planos gratuitos. A primeira ingestão em nuvem, em 29/09/2026, já incorporou a semana 38 de 2026, publicada pelo InfoDengue depois do recorte usado nesta análise; por isso os totais exibidos no painel podem diferir levemente dos apresentados nas</w:t>
+      </w:r>
+      <w:r>
+        <w:t xml:space="preserve"> tabelas deste relatório.</w:t>
       </w:r>
     </w:p>
     <w:p>
@@ -5952,14 +5955,14 @@
         <w:t>Próximos passos.</w:t>
       </w:r>
       <w:r>
-        <w:t xml:space="preserve"> Até a entrega final estão previstos: (a) publicação do repositório no GitHub e do painel no Render, com banco no Neon; (b) aplicação do questionário do Apêndice A a moradores e profissionais de saúde, para avaliar a compreensão do painel e coletar sugestões; (c) teste do painel com leitor de tela (NVDA); e (d) incorporação das devolutivas ao painel e ao relatório final.</w:t>
+        <w:t xml:space="preserve"> Até a entrega final estão previstos: (a) aplicação do questionário do Apêndice A a moradores e profissionais de saúde, para avaliar a compreensão do painel e coletar sugestões; (b) teste do painel com leitor de tela (NVDA); e (c) incorporação das devolutivas ao painel e ao relatório final.</w:t>
       </w:r>
     </w:p>
     <w:p>
       <w:pPr>
         <w:pStyle w:val="1ttulonivel1"/>
       </w:pPr>
-      <w:bookmarkStart w:id="17" w:name="_Toc241604118"/>
+      <w:bookmarkStart w:id="17" w:name="_Toc241607329"/>
       <w:r>
         <w:lastRenderedPageBreak/>
         <w:t>Referências</w:t>
@@ -6226,7 +6229,7 @@
       <w:pPr>
         <w:pStyle w:val="1ttulonivel1"/>
       </w:pPr>
-      <w:bookmarkStart w:id="18" w:name="_Toc241604119"/>
+      <w:bookmarkStart w:id="18" w:name="_Toc241607330"/>
       <w:r>
         <w:lastRenderedPageBreak/>
         <w:t>Apêndice A – Questionário de avaliação do painel</w:t>
@@ -8877,7 +8880,7 @@
     <w:next w:val="Normal"/>
     <w:uiPriority w:val="99"/>
     <w:unhideWhenUsed/>
-    <w:rsid w:val="00A80E4D"/>
+    <w:rsid w:val="00F67178"/>
   </w:style>
 </w:styles>
 </file>

</xml_diff>